<commit_message>
Plano de despliegue de Render
render.yaml crea el servicio desde un Blueprint en vez del formulario. El health
check se deja vacio: con la seguridad activada cualquier ruta responde 401 y
Render daria el despliegue por caido.

AN110 seccion 10 recoge el plano y avisa de que SUPABASE_ANON_KEY y
SUPABASE_SERVICE_ROLE_KEY hacen falta con AUTH_ENABLED=true.

Co-Authored-By: Claude Opus 5 (1M context) <noreply@anthropic.com>
</commit_message>
<xml_diff>
--- a/documentacion/AN110-manual-de-instalación.docx
+++ b/documentacion/AN110-manual-de-instalación.docx
@@ -7858,17 +7858,48 @@
       </w:pPr>
       <w:r>
         <w:rPr/>
-        <w:t xml:space="preserve">Servicio de tipo </w:t>
+        <w:t xml:space="preserve">La forma corta es </w:t>
       </w:r>
       <w:r>
         <w:rPr>
           <w:rStyle w:val="Strong"/>
         </w:rPr>
+        <w:t>New -&gt; Blueprint</w:t>
+      </w:r>
+      <w:r>
+        <w:rPr/>
+        <w:t xml:space="preserve"> apuntando al repositorio: Render lee </w:t>
+      </w:r>
+      <w:r>
+        <w:rPr>
+          <w:rStyle w:val="Textooriginal"/>
+        </w:rPr>
+        <w:t>render.yaml</w:t>
+      </w:r>
+      <w:r>
+        <w:rPr/>
+        <w:t xml:space="preserve"> de la raíz y crea el servicio con todos los ajustes puestos. Solo hay que escribir los valores de las variables marcadas como secretas.</w:t>
+      </w:r>
+    </w:p>
+    <w:p>
+      <w:pPr>
+        <w:pStyle w:val="BodyText"/>
+        <w:bidi w:val="0"/>
+        <w:rPr/>
+      </w:pPr>
+      <w:r>
+        <w:rPr/>
+        <w:t xml:space="preserve">Si se prefiere el formulario, es un </w:t>
+      </w:r>
+      <w:r>
+        <w:rPr>
+          <w:rStyle w:val="Strong"/>
+        </w:rPr>
         <w:t>Web Service</w:t>
       </w:r>
       <w:r>
         <w:rPr/>
-        <w:t>, conectado al repositorio de GitHub:</w:t>
+        <w:t xml:space="preserve"> con estos ajustes:</w:t>
       </w:r>
     </w:p>
     <w:tbl>
@@ -8110,14 +8141,51 @@
             </w:pPr>
             <w:r>
               <w:rPr>
-                <w:rStyle w:val="Textooriginal"/>
+                <w:rStyle w:val="Strong"/>
               </w:rPr>
-              <w:t>/v1/books</w:t>
+              <w:t>vacío</w:t>
             </w:r>
           </w:p>
         </w:tc>
       </w:tr>
     </w:tbl>
+    <w:p>
+      <w:pPr>
+        <w:pStyle w:val="BodyText"/>
+        <w:bidi w:val="0"/>
+        <w:rPr/>
+      </w:pPr>
+      <w:r>
+        <w:rPr>
+          <w:rStyle w:val="Strong"/>
+        </w:rPr>
+        <w:t>El health check se deja vacío a propósito.</w:t>
+      </w:r>
+      <w:r>
+        <w:rPr/>
+        <w:t xml:space="preserve"> Con </w:t>
+      </w:r>
+      <w:r>
+        <w:rPr>
+          <w:rStyle w:val="Textooriginal"/>
+        </w:rPr>
+        <w:t>AUTH_ENABLED=true</w:t>
+      </w:r>
+      <w:r>
+        <w:rPr/>
+        <w:t xml:space="preserve">, todo lo que no sea </w:t>
+      </w:r>
+      <w:r>
+        <w:rPr>
+          <w:rStyle w:val="Textooriginal"/>
+        </w:rPr>
+        <w:t>/login/**</w:t>
+      </w:r>
+      <w:r>
+        <w:rPr/>
+        <w:t xml:space="preserve"> exige token: cualquier ruta que se ponga ahí responde 401 y Render da el despliegue por caído aunque la aplicación esté perfectamente viva. Sin ruta, Render comprueba que el proceso abra el puerto, que es lo que de verdad indica que arrancó.</w:t>
+      </w:r>
+    </w:p>
     <w:p>
       <w:pPr>
         <w:pStyle w:val="BodyText"/>
@@ -8765,6 +8833,64 @@
       <w:r>
         <w:rPr/>
         <w:t>10.4 El acceso, con seguridad activada</w:t>
+      </w:r>
+    </w:p>
+    <w:p>
+      <w:pPr>
+        <w:pStyle w:val="Citaenbloque"/>
+        <w:bidi w:val="0"/>
+        <w:jc w:val="left"/>
+        <w:rPr/>
+      </w:pPr>
+      <w:r>
+        <w:rPr>
+          <w:rStyle w:val="Strong"/>
+        </w:rPr>
+        <w:t>Antes de empezar:</w:t>
+      </w:r>
+      <w:r>
+        <w:rPr/>
+        <w:t xml:space="preserve"> con </w:t>
+      </w:r>
+      <w:r>
+        <w:rPr>
+          <w:rStyle w:val="Textooriginal"/>
+        </w:rPr>
+        <w:t>AUTH_ENABLED=true</w:t>
+      </w:r>
+      <w:r>
+        <w:rPr/>
+        <w:t xml:space="preserve"> hacen falta </w:t>
+      </w:r>
+      <w:r>
+        <w:rPr>
+          <w:rStyle w:val="Textooriginal"/>
+        </w:rPr>
+        <w:t>SUPABASE_ANON_KEY</w:t>
+      </w:r>
+      <w:r>
+        <w:rPr/>
+        <w:t xml:space="preserve"> y </w:t>
+      </w:r>
+      <w:r>
+        <w:rPr>
+          <w:rStyle w:val="Textooriginal"/>
+        </w:rPr>
+        <w:t>SUPABASE_SERVICE_ROLE_KEY</w:t>
+      </w:r>
+      <w:r>
+        <w:rPr/>
+        <w:t xml:space="preserve">, que en el entorno local están vacías porque ahí se trabaja con la seguridad desactivada. Se copian del panel de Supabase, en </w:t>
+      </w:r>
+      <w:r>
+        <w:rPr>
+          <w:rStyle w:val="Emphasis"/>
+        </w:rPr>
+        <w:t>Project Settings -&gt; API</w:t>
+      </w:r>
+      <w:r>
+        <w:rPr/>
+        <w:t>. Sin la primera, el acceso devuelve error aunque el usuario y la contraseña sean correctos.</w:t>
       </w:r>
     </w:p>
     <w:p>

</xml_diff>